<commit_message>
Cập nhật chính xác các file
</commit_message>
<xml_diff>
--- a/Lab05/OfficeComputingLabsReport.docx
+++ b/Lab05/OfficeComputingLabsReport.docx
@@ -922,7 +922,7 @@
                 <w:noProof/>
                 <w:webHidden/>
               </w:rPr>
-              <w:t>36</w:t>
+              <w:t>37</w:t>
             </w:r>
             <w:r>
               <w:rPr>
@@ -990,7 +990,7 @@
                 <w:noProof/>
                 <w:webHidden/>
               </w:rPr>
-              <w:t>36</w:t>
+              <w:t>37</w:t>
             </w:r>
             <w:r>
               <w:rPr>
@@ -1058,7 +1058,7 @@
                 <w:noProof/>
                 <w:webHidden/>
               </w:rPr>
-              <w:t>36</w:t>
+              <w:t>37</w:t>
             </w:r>
             <w:r>
               <w:rPr>
@@ -1126,7 +1126,7 @@
                 <w:noProof/>
                 <w:webHidden/>
               </w:rPr>
-              <w:t>36</w:t>
+              <w:t>41</w:t>
             </w:r>
             <w:r>
               <w:rPr>
@@ -1194,7 +1194,7 @@
                 <w:noProof/>
                 <w:webHidden/>
               </w:rPr>
-              <w:t>36</w:t>
+              <w:t>47</w:t>
             </w:r>
             <w:r>
               <w:rPr>
@@ -1262,7 +1262,7 @@
                 <w:noProof/>
                 <w:webHidden/>
               </w:rPr>
-              <w:t>36</w:t>
+              <w:t>47</w:t>
             </w:r>
             <w:r>
               <w:rPr>
@@ -2270,6 +2270,106 @@
     </w:p>
     <w:p>
       <w:pPr>
+        <w:pStyle w:val="Heading3"/>
+      </w:pPr>
+      <w:r>
+        <w:t xml:space="preserve">Bài 3: </w:t>
+      </w:r>
+      <w:r>
+        <w:t>Bài thực hành số 3 - Google Docs</w:t>
+      </w:r>
+    </w:p>
+    <w:p>
+      <w:hyperlink r:id="rId30" w:history="1">
+        <w:r>
+          <w:rPr>
+            <w:rStyle w:val="Hyperlink"/>
+          </w:rPr>
+          <w:t>https://docs.google.com/document/d/1GCDqWxPF7Fu1UhEmo1BTDGqZ5qRnATTJ2JA1D2UvcQk/edit?usp=sharing</w:t>
+        </w:r>
+      </w:hyperlink>
+    </w:p>
+    <w:p>
+      <w:r>
+        <w:lastRenderedPageBreak/>
+        <w:drawing>
+          <wp:inline distT="0" distB="0" distL="0" distR="0" wp14:anchorId="342A85D5" wp14:editId="7F502544">
+            <wp:extent cx="5943600" cy="2526665"/>
+            <wp:effectExtent l="0" t="0" r="0" b="6985"/>
+            <wp:docPr id="2027571403" name="Picture 1"/>
+            <wp:cNvGraphicFramePr>
+              <a:graphicFrameLocks xmlns:a="http://schemas.openxmlformats.org/drawingml/2006/main" noChangeAspect="1"/>
+            </wp:cNvGraphicFramePr>
+            <a:graphic xmlns:a="http://schemas.openxmlformats.org/drawingml/2006/main">
+              <a:graphicData uri="http://schemas.openxmlformats.org/drawingml/2006/picture">
+                <pic:pic xmlns:pic="http://schemas.openxmlformats.org/drawingml/2006/picture">
+                  <pic:nvPicPr>
+                    <pic:cNvPr id="2027571403" name=""/>
+                    <pic:cNvPicPr/>
+                  </pic:nvPicPr>
+                  <pic:blipFill>
+                    <a:blip r:embed="rId31"/>
+                    <a:stretch>
+                      <a:fillRect/>
+                    </a:stretch>
+                  </pic:blipFill>
+                  <pic:spPr>
+                    <a:xfrm>
+                      <a:off x="0" y="0"/>
+                      <a:ext cx="5943600" cy="2526665"/>
+                    </a:xfrm>
+                    <a:prstGeom prst="rect">
+                      <a:avLst/>
+                    </a:prstGeom>
+                  </pic:spPr>
+                </pic:pic>
+              </a:graphicData>
+            </a:graphic>
+          </wp:inline>
+        </w:drawing>
+      </w:r>
+    </w:p>
+    <w:p>
+      <w:r>
+        <w:drawing>
+          <wp:inline distT="0" distB="0" distL="0" distR="0" wp14:anchorId="7AD73FAC" wp14:editId="3150074D">
+            <wp:extent cx="5943600" cy="2902585"/>
+            <wp:effectExtent l="0" t="0" r="0" b="0"/>
+            <wp:docPr id="2078004000" name="Picture 1"/>
+            <wp:cNvGraphicFramePr>
+              <a:graphicFrameLocks xmlns:a="http://schemas.openxmlformats.org/drawingml/2006/main" noChangeAspect="1"/>
+            </wp:cNvGraphicFramePr>
+            <a:graphic xmlns:a="http://schemas.openxmlformats.org/drawingml/2006/main">
+              <a:graphicData uri="http://schemas.openxmlformats.org/drawingml/2006/picture">
+                <pic:pic xmlns:pic="http://schemas.openxmlformats.org/drawingml/2006/picture">
+                  <pic:nvPicPr>
+                    <pic:cNvPr id="2078004000" name=""/>
+                    <pic:cNvPicPr/>
+                  </pic:nvPicPr>
+                  <pic:blipFill>
+                    <a:blip r:embed="rId32"/>
+                    <a:stretch>
+                      <a:fillRect/>
+                    </a:stretch>
+                  </pic:blipFill>
+                  <pic:spPr>
+                    <a:xfrm>
+                      <a:off x="0" y="0"/>
+                      <a:ext cx="5943600" cy="2902585"/>
+                    </a:xfrm>
+                    <a:prstGeom prst="rect">
+                      <a:avLst/>
+                    </a:prstGeom>
+                  </pic:spPr>
+                </pic:pic>
+              </a:graphicData>
+            </a:graphic>
+          </wp:inline>
+        </w:drawing>
+      </w:r>
+    </w:p>
+    <w:p>
+      <w:pPr>
         <w:pStyle w:val="Heading1"/>
       </w:pPr>
       <w:bookmarkStart w:id="4" w:name="_Toc241245215"/>
@@ -2324,7 +2424,7 @@
                     <pic:cNvPicPr/>
                   </pic:nvPicPr>
                   <pic:blipFill>
-                    <a:blip r:embed="rId30"/>
+                    <a:blip r:embed="rId33"/>
                     <a:stretch>
                       <a:fillRect/>
                     </a:stretch>
@@ -2365,7 +2465,7 @@
                     <pic:cNvPicPr/>
                   </pic:nvPicPr>
                   <pic:blipFill>
-                    <a:blip r:embed="rId31"/>
+                    <a:blip r:embed="rId34"/>
                     <a:stretch>
                       <a:fillRect/>
                     </a:stretch>
@@ -2406,7 +2506,7 @@
                     <pic:cNvPicPr/>
                   </pic:nvPicPr>
                   <pic:blipFill>
-                    <a:blip r:embed="rId32"/>
+                    <a:blip r:embed="rId35"/>
                     <a:stretch>
                       <a:fillRect/>
                     </a:stretch>
@@ -2447,7 +2547,7 @@
                     <pic:cNvPicPr/>
                   </pic:nvPicPr>
                   <pic:blipFill>
-                    <a:blip r:embed="rId33"/>
+                    <a:blip r:embed="rId36"/>
                     <a:stretch>
                       <a:fillRect/>
                     </a:stretch>
@@ -2488,7 +2588,7 @@
                     <pic:cNvPicPr/>
                   </pic:nvPicPr>
                   <pic:blipFill>
-                    <a:blip r:embed="rId34"/>
+                    <a:blip r:embed="rId37"/>
                     <a:stretch>
                       <a:fillRect/>
                     </a:stretch>
@@ -2529,7 +2629,7 @@
                     <pic:cNvPicPr/>
                   </pic:nvPicPr>
                   <pic:blipFill>
-                    <a:blip r:embed="rId35"/>
+                    <a:blip r:embed="rId38"/>
                     <a:stretch>
                       <a:fillRect/>
                     </a:stretch>
@@ -2570,7 +2670,7 @@
                     <pic:cNvPicPr/>
                   </pic:nvPicPr>
                   <pic:blipFill>
-                    <a:blip r:embed="rId36"/>
+                    <a:blip r:embed="rId39"/>
                     <a:stretch>
                       <a:fillRect/>
                     </a:stretch>
@@ -2626,7 +2726,7 @@
                     <pic:cNvPicPr/>
                   </pic:nvPicPr>
                   <pic:blipFill>
-                    <a:blip r:embed="rId37"/>
+                    <a:blip r:embed="rId40"/>
                     <a:stretch>
                       <a:fillRect/>
                     </a:stretch>
@@ -2666,7 +2766,7 @@
                     <pic:cNvPicPr/>
                   </pic:nvPicPr>
                   <pic:blipFill>
-                    <a:blip r:embed="rId38"/>
+                    <a:blip r:embed="rId41"/>
                     <a:stretch>
                       <a:fillRect/>
                     </a:stretch>
@@ -2707,7 +2807,7 @@
                     <pic:cNvPicPr/>
                   </pic:nvPicPr>
                   <pic:blipFill>
-                    <a:blip r:embed="rId39"/>
+                    <a:blip r:embed="rId42"/>
                     <a:stretch>
                       <a:fillRect/>
                     </a:stretch>
@@ -2747,7 +2847,7 @@
                     <pic:cNvPicPr/>
                   </pic:nvPicPr>
                   <pic:blipFill>
-                    <a:blip r:embed="rId40"/>
+                    <a:blip r:embed="rId43"/>
                     <a:stretch>
                       <a:fillRect/>
                     </a:stretch>
@@ -2788,7 +2888,7 @@
                     <pic:cNvPicPr/>
                   </pic:nvPicPr>
                   <pic:blipFill>
-                    <a:blip r:embed="rId41"/>
+                    <a:blip r:embed="rId44"/>
                     <a:stretch>
                       <a:fillRect/>
                     </a:stretch>
@@ -2845,6 +2945,9 @@
     </w:p>
     <w:p>
       <w:r>
+        <w:rPr>
+          <w:noProof/>
+        </w:rPr>
         <w:drawing>
           <wp:inline distT="0" distB="0" distL="0" distR="0" wp14:anchorId="2B9B574B" wp14:editId="19854C2B">
             <wp:extent cx="5943600" cy="3369310"/>
@@ -2861,7 +2964,7 @@
                     <pic:cNvPicPr/>
                   </pic:nvPicPr>
                   <pic:blipFill>
-                    <a:blip r:embed="rId42"/>
+                    <a:blip r:embed="rId45"/>
                     <a:stretch>
                       <a:fillRect/>
                     </a:stretch>
@@ -2882,6 +2985,9 @@
         </w:drawing>
       </w:r>
       <w:r>
+        <w:rPr>
+          <w:noProof/>
+        </w:rPr>
         <w:drawing>
           <wp:inline distT="0" distB="0" distL="0" distR="0" wp14:anchorId="146E78DB" wp14:editId="5626BAEB">
             <wp:extent cx="5943600" cy="3352165"/>
@@ -2898,7 +3004,7 @@
                     <pic:cNvPicPr/>
                   </pic:nvPicPr>
                   <pic:blipFill>
-                    <a:blip r:embed="rId43"/>
+                    <a:blip r:embed="rId46"/>
                     <a:stretch>
                       <a:fillRect/>
                     </a:stretch>
@@ -2919,6 +3025,9 @@
         </w:drawing>
       </w:r>
       <w:r>
+        <w:rPr>
+          <w:noProof/>
+        </w:rPr>
         <w:lastRenderedPageBreak/>
         <w:drawing>
           <wp:inline distT="0" distB="0" distL="0" distR="0" wp14:anchorId="221548F7" wp14:editId="5BF8B113">
@@ -2936,7 +3045,7 @@
                     <pic:cNvPicPr/>
                   </pic:nvPicPr>
                   <pic:blipFill>
-                    <a:blip r:embed="rId44"/>
+                    <a:blip r:embed="rId47"/>
                     <a:stretch>
                       <a:fillRect/>
                     </a:stretch>
@@ -2957,6 +3066,9 @@
         </w:drawing>
       </w:r>
       <w:r>
+        <w:rPr>
+          <w:noProof/>
+        </w:rPr>
         <w:drawing>
           <wp:inline distT="0" distB="0" distL="0" distR="0" wp14:anchorId="4046C7FE" wp14:editId="459CF85C">
             <wp:extent cx="5943600" cy="3371850"/>
@@ -2973,7 +3085,7 @@
                     <pic:cNvPicPr/>
                   </pic:nvPicPr>
                   <pic:blipFill>
-                    <a:blip r:embed="rId45"/>
+                    <a:blip r:embed="rId48"/>
                     <a:stretch>
                       <a:fillRect/>
                     </a:stretch>
@@ -2994,6 +3106,9 @@
         </w:drawing>
       </w:r>
       <w:r>
+        <w:rPr>
+          <w:noProof/>
+        </w:rPr>
         <w:lastRenderedPageBreak/>
         <w:drawing>
           <wp:inline distT="0" distB="0" distL="0" distR="0" wp14:anchorId="0A33BB15" wp14:editId="070C8057">
@@ -3011,7 +3126,7 @@
                     <pic:cNvPicPr/>
                   </pic:nvPicPr>
                   <pic:blipFill>
-                    <a:blip r:embed="rId46"/>
+                    <a:blip r:embed="rId49"/>
                     <a:stretch>
                       <a:fillRect/>
                     </a:stretch>
@@ -3032,6 +3147,9 @@
         </w:drawing>
       </w:r>
       <w:r>
+        <w:rPr>
+          <w:noProof/>
+        </w:rPr>
         <w:drawing>
           <wp:inline distT="0" distB="0" distL="0" distR="0" wp14:anchorId="37414C99" wp14:editId="32091E7B">
             <wp:extent cx="5943600" cy="3364865"/>
@@ -3048,7 +3166,7 @@
                     <pic:cNvPicPr/>
                   </pic:nvPicPr>
                   <pic:blipFill>
-                    <a:blip r:embed="rId47"/>
+                    <a:blip r:embed="rId50"/>
                     <a:stretch>
                       <a:fillRect/>
                     </a:stretch>
@@ -3069,6 +3187,9 @@
         </w:drawing>
       </w:r>
       <w:r>
+        <w:rPr>
+          <w:noProof/>
+        </w:rPr>
         <w:lastRenderedPageBreak/>
         <w:drawing>
           <wp:inline distT="0" distB="0" distL="0" distR="0" wp14:anchorId="66634A74" wp14:editId="69697D12">
@@ -3086,7 +3207,7 @@
                     <pic:cNvPicPr/>
                   </pic:nvPicPr>
                   <pic:blipFill>
-                    <a:blip r:embed="rId48"/>
+                    <a:blip r:embed="rId51"/>
                     <a:stretch>
                       <a:fillRect/>
                     </a:stretch>
@@ -3107,6 +3228,9 @@
         </w:drawing>
       </w:r>
       <w:r>
+        <w:rPr>
+          <w:noProof/>
+        </w:rPr>
         <w:drawing>
           <wp:inline distT="0" distB="0" distL="0" distR="0" wp14:anchorId="387364E2" wp14:editId="0BEAABF8">
             <wp:extent cx="5943600" cy="3390265"/>
@@ -3123,7 +3247,7 @@
                     <pic:cNvPicPr/>
                   </pic:nvPicPr>
                   <pic:blipFill>
-                    <a:blip r:embed="rId49"/>
+                    <a:blip r:embed="rId52"/>
                     <a:stretch>
                       <a:fillRect/>
                     </a:stretch>
@@ -3161,6 +3285,9 @@
     </w:p>
     <w:p>
       <w:r>
+        <w:rPr>
+          <w:noProof/>
+        </w:rPr>
         <w:drawing>
           <wp:inline distT="0" distB="0" distL="0" distR="0" wp14:anchorId="6288ABA5" wp14:editId="2AFF0A25">
             <wp:extent cx="5943600" cy="3367405"/>
@@ -3177,7 +3304,7 @@
                     <pic:cNvPicPr/>
                   </pic:nvPicPr>
                   <pic:blipFill>
-                    <a:blip r:embed="rId50"/>
+                    <a:blip r:embed="rId53"/>
                     <a:stretch>
                       <a:fillRect/>
                     </a:stretch>
@@ -3198,6 +3325,9 @@
         </w:drawing>
       </w:r>
       <w:r>
+        <w:rPr>
+          <w:noProof/>
+        </w:rPr>
         <w:drawing>
           <wp:inline distT="0" distB="0" distL="0" distR="0" wp14:anchorId="3DF3DA6C" wp14:editId="77B752D9">
             <wp:extent cx="5943600" cy="3348990"/>
@@ -3214,7 +3344,7 @@
                     <pic:cNvPicPr/>
                   </pic:nvPicPr>
                   <pic:blipFill>
-                    <a:blip r:embed="rId51"/>
+                    <a:blip r:embed="rId54"/>
                     <a:stretch>
                       <a:fillRect/>
                     </a:stretch>
@@ -3235,6 +3365,9 @@
         </w:drawing>
       </w:r>
       <w:r>
+        <w:rPr>
+          <w:noProof/>
+        </w:rPr>
         <w:lastRenderedPageBreak/>
         <w:drawing>
           <wp:inline distT="0" distB="0" distL="0" distR="0" wp14:anchorId="2FEA9925" wp14:editId="03069207">
@@ -3252,7 +3385,7 @@
                     <pic:cNvPicPr/>
                   </pic:nvPicPr>
                   <pic:blipFill>
-                    <a:blip r:embed="rId52"/>
+                    <a:blip r:embed="rId55"/>
                     <a:stretch>
                       <a:fillRect/>
                     </a:stretch>
@@ -3273,6 +3406,9 @@
         </w:drawing>
       </w:r>
       <w:r>
+        <w:rPr>
+          <w:noProof/>
+        </w:rPr>
         <w:drawing>
           <wp:inline distT="0" distB="0" distL="0" distR="0" wp14:anchorId="64C338F9" wp14:editId="7B9EF9B4">
             <wp:extent cx="5943600" cy="3378200"/>
@@ -3289,7 +3425,7 @@
                     <pic:cNvPicPr/>
                   </pic:nvPicPr>
                   <pic:blipFill>
-                    <a:blip r:embed="rId53"/>
+                    <a:blip r:embed="rId56"/>
                     <a:stretch>
                       <a:fillRect/>
                     </a:stretch>
@@ -3310,6 +3446,9 @@
         </w:drawing>
       </w:r>
       <w:r>
+        <w:rPr>
+          <w:noProof/>
+        </w:rPr>
         <w:lastRenderedPageBreak/>
         <w:drawing>
           <wp:inline distT="0" distB="0" distL="0" distR="0" wp14:anchorId="496363F9" wp14:editId="7BDB901E">
@@ -3327,7 +3466,7 @@
                     <pic:cNvPicPr/>
                   </pic:nvPicPr>
                   <pic:blipFill>
-                    <a:blip r:embed="rId54"/>
+                    <a:blip r:embed="rId57"/>
                     <a:stretch>
                       <a:fillRect/>
                     </a:stretch>
@@ -3348,6 +3487,9 @@
         </w:drawing>
       </w:r>
       <w:r>
+        <w:rPr>
+          <w:noProof/>
+        </w:rPr>
         <w:drawing>
           <wp:inline distT="0" distB="0" distL="0" distR="0" wp14:anchorId="70344E1D" wp14:editId="5E55CF97">
             <wp:extent cx="5943600" cy="3347720"/>
@@ -3364,7 +3506,7 @@
                     <pic:cNvPicPr/>
                   </pic:nvPicPr>
                   <pic:blipFill>
-                    <a:blip r:embed="rId55"/>
+                    <a:blip r:embed="rId58"/>
                     <a:stretch>
                       <a:fillRect/>
                     </a:stretch>
@@ -3385,6 +3527,9 @@
         </w:drawing>
       </w:r>
       <w:r>
+        <w:rPr>
+          <w:noProof/>
+        </w:rPr>
         <w:lastRenderedPageBreak/>
         <w:drawing>
           <wp:inline distT="0" distB="0" distL="0" distR="0" wp14:anchorId="4CE46E94" wp14:editId="2AB1B7B1">
@@ -3402,7 +3547,7 @@
                     <pic:cNvPicPr/>
                   </pic:nvPicPr>
                   <pic:blipFill>
-                    <a:blip r:embed="rId56"/>
+                    <a:blip r:embed="rId59"/>
                     <a:stretch>
                       <a:fillRect/>
                     </a:stretch>
@@ -3423,6 +3568,9 @@
         </w:drawing>
       </w:r>
       <w:r>
+        <w:rPr>
+          <w:noProof/>
+        </w:rPr>
         <w:drawing>
           <wp:inline distT="0" distB="0" distL="0" distR="0" wp14:anchorId="18E798EF" wp14:editId="5BB7495C">
             <wp:extent cx="5943600" cy="3373120"/>
@@ -3439,7 +3587,7 @@
                     <pic:cNvPicPr/>
                   </pic:nvPicPr>
                   <pic:blipFill>
-                    <a:blip r:embed="rId57"/>
+                    <a:blip r:embed="rId60"/>
                     <a:stretch>
                       <a:fillRect/>
                     </a:stretch>
@@ -3460,6 +3608,9 @@
         </w:drawing>
       </w:r>
       <w:r>
+        <w:rPr>
+          <w:noProof/>
+        </w:rPr>
         <w:lastRenderedPageBreak/>
         <w:drawing>
           <wp:inline distT="0" distB="0" distL="0" distR="0" wp14:anchorId="01611681" wp14:editId="16145A60">
@@ -3477,7 +3628,7 @@
                     <pic:cNvPicPr/>
                   </pic:nvPicPr>
                   <pic:blipFill>
-                    <a:blip r:embed="rId58"/>
+                    <a:blip r:embed="rId61"/>
                     <a:stretch>
                       <a:fillRect/>
                     </a:stretch>
@@ -3498,6 +3649,9 @@
         </w:drawing>
       </w:r>
       <w:r>
+        <w:rPr>
+          <w:noProof/>
+        </w:rPr>
         <w:drawing>
           <wp:inline distT="0" distB="0" distL="0" distR="0" wp14:anchorId="71640B6B" wp14:editId="0E2569BF">
             <wp:extent cx="5943600" cy="3369310"/>
@@ -3514,7 +3668,7 @@
                     <pic:cNvPicPr/>
                   </pic:nvPicPr>
                   <pic:blipFill>
-                    <a:blip r:embed="rId59"/>
+                    <a:blip r:embed="rId62"/>
                     <a:stretch>
                       <a:fillRect/>
                     </a:stretch>
@@ -3535,6 +3689,9 @@
         </w:drawing>
       </w:r>
       <w:r>
+        <w:rPr>
+          <w:noProof/>
+        </w:rPr>
         <w:lastRenderedPageBreak/>
         <w:drawing>
           <wp:inline distT="0" distB="0" distL="0" distR="0" wp14:anchorId="77FCBF31" wp14:editId="15229C1F">
@@ -3552,7 +3709,7 @@
                     <pic:cNvPicPr/>
                   </pic:nvPicPr>
                   <pic:blipFill>
-                    <a:blip r:embed="rId60"/>
+                    <a:blip r:embed="rId63"/>
                     <a:stretch>
                       <a:fillRect/>
                     </a:stretch>
@@ -3573,6 +3730,9 @@
         </w:drawing>
       </w:r>
       <w:r>
+        <w:rPr>
+          <w:noProof/>
+        </w:rPr>
         <w:drawing>
           <wp:inline distT="0" distB="0" distL="0" distR="0" wp14:anchorId="12BC45B1" wp14:editId="4A1084D6">
             <wp:extent cx="5943600" cy="3361055"/>
@@ -3589,7 +3749,7 @@
                     <pic:cNvPicPr/>
                   </pic:nvPicPr>
                   <pic:blipFill>
-                    <a:blip r:embed="rId61"/>
+                    <a:blip r:embed="rId64"/>
                     <a:stretch>
                       <a:fillRect/>
                     </a:stretch>
@@ -3610,6 +3770,9 @@
         </w:drawing>
       </w:r>
       <w:r>
+        <w:rPr>
+          <w:noProof/>
+        </w:rPr>
         <w:lastRenderedPageBreak/>
         <w:drawing>
           <wp:inline distT="0" distB="0" distL="0" distR="0" wp14:anchorId="1CBFBB3F" wp14:editId="6BDA115E">
@@ -3627,7 +3790,7 @@
                     <pic:cNvPicPr/>
                   </pic:nvPicPr>
                   <pic:blipFill>
-                    <a:blip r:embed="rId62"/>
+                    <a:blip r:embed="rId65"/>
                     <a:stretch>
                       <a:fillRect/>
                     </a:stretch>
@@ -3648,6 +3811,9 @@
         </w:drawing>
       </w:r>
       <w:r>
+        <w:rPr>
+          <w:noProof/>
+        </w:rPr>
         <w:drawing>
           <wp:inline distT="0" distB="0" distL="0" distR="0" wp14:anchorId="6C32D0AF" wp14:editId="723F0924">
             <wp:extent cx="5943600" cy="3302000"/>
@@ -3664,7 +3830,7 @@
                     <pic:cNvPicPr/>
                   </pic:nvPicPr>
                   <pic:blipFill>
-                    <a:blip r:embed="rId63"/>
+                    <a:blip r:embed="rId66"/>
                     <a:stretch>
                       <a:fillRect/>
                     </a:stretch>
@@ -4830,6 +4996,18 @@
       <w:u w:val="single"/>
     </w:rPr>
   </w:style>
+  <w:style w:type="character" w:styleId="UnresolvedMention">
+    <w:name w:val="Unresolved Mention"/>
+    <w:basedOn w:val="DefaultParagraphFont"/>
+    <w:uiPriority w:val="99"/>
+    <w:semiHidden/>
+    <w:unhideWhenUsed/>
+    <w:rsid w:val="008A76E0"/>
+    <w:rPr>
+      <w:color w:val="605E5C"/>
+      <w:shd w:val="clear" w:color="auto" w:fill="E1DFDD"/>
+    </w:rPr>
+  </w:style>
 </w:styles>
 </file>
 

</xml_diff>